<commit_message>
Fix fonts in ESV version
</commit_message>
<xml_diff>
--- a/static/groups/small-groups/20/lcv-esv-20.docx
+++ b/static/groups/small-groups/20/lcv-esv-20.docx
@@ -43,27 +43,7 @@
           <w:sz w:val="24"/>
           <w:szCs w:val="24"/>
         </w:rPr>
-        <w:t>New International Version 1984 (</w:t>
-      </w:r>
-      <w:r>
-        <w:rPr>
-          <w:rFonts w:asciiTheme="minorHAnsi" w:hAnsiTheme="minorHAnsi"/>
-          <w:b/>
-          <w:bCs/>
-          <w:sz w:val="24"/>
-          <w:szCs w:val="24"/>
-        </w:rPr>
-        <w:t>ESV</w:t>
-      </w:r>
-      <w:r>
-        <w:rPr>
-          <w:rFonts w:asciiTheme="minorHAnsi" w:hAnsiTheme="minorHAnsi"/>
-          <w:b/>
-          <w:bCs/>
-          <w:sz w:val="24"/>
-          <w:szCs w:val="24"/>
-        </w:rPr>
-        <w:t>)</w:t>
+        <w:t>New International Version 1984 (ESV)</w:t>
       </w:r>
       <w:r>
         <w:rPr>
@@ -84,8 +64,8 @@
           <w:b/>
           <w:bCs/>
           <w:color w:val="auto"/>
-          <w:sz w:val="40"/>
-          <w:szCs w:val="40"/>
+          <w:sz w:val="24"/>
+          <w:szCs w:val="24"/>
           <w:vertAlign w:val="superscript"/>
           <w14:ligatures w14:val="standardContextual"/>
         </w:rPr>
@@ -367,7 +347,24 @@
           <w:sz w:val="24"/>
           <w:szCs w:val="24"/>
         </w:rPr>
-        <w:t xml:space="preserve">And you, who once were alienated and hostile in mind, doing evil deeds, 22 he has now reconciled in his body of flesh by his death, </w:t>
+        <w:t xml:space="preserve">And you, who once were alienated and hostile in mind, doing evil deeds, </w:t>
+      </w:r>
+      <w:r>
+        <w:rPr>
+          <w:rFonts w:asciiTheme="minorHAnsi" w:hAnsiTheme="minorHAnsi"/>
+          <w:sz w:val="24"/>
+          <w:szCs w:val="24"/>
+          <w:vertAlign w:val="superscript"/>
+        </w:rPr>
+        <w:t>22</w:t>
+      </w:r>
+      <w:r>
+        <w:rPr>
+          <w:rFonts w:asciiTheme="minorHAnsi" w:hAnsiTheme="minorHAnsi"/>
+          <w:sz w:val="24"/>
+          <w:szCs w:val="24"/>
+        </w:rPr>
+        <w:t xml:space="preserve"> he has now reconciled in his body of flesh by his death, </w:t>
       </w:r>
       <w:proofErr w:type="gramStart"/>
       <w:r>

</xml_diff>

<commit_message>
Adding KJV to NL20
</commit_message>
<xml_diff>
--- a/static/groups/small-groups/20/lcv-esv-20.docx
+++ b/static/groups/small-groups/20/lcv-esv-20.docx
@@ -432,7 +432,24 @@
           <w:sz w:val="24"/>
           <w:szCs w:val="24"/>
         </w:rPr>
-        <w:t>In this is love, not that we have loved God but that he loved us and sent his Son to be the propitiation for our sins. 11 Beloved, if God so loved us, we also ought to love one another.</w:t>
+        <w:t xml:space="preserve">In this is love, not that we have loved God but that he loved us and sent his Son to be the propitiation for our sins. </w:t>
+      </w:r>
+      <w:r>
+        <w:rPr>
+          <w:rFonts w:asciiTheme="minorHAnsi" w:hAnsiTheme="minorHAnsi"/>
+          <w:sz w:val="24"/>
+          <w:szCs w:val="24"/>
+          <w:vertAlign w:val="superscript"/>
+        </w:rPr>
+        <w:t>11</w:t>
+      </w:r>
+      <w:r>
+        <w:rPr>
+          <w:rFonts w:asciiTheme="minorHAnsi" w:hAnsiTheme="minorHAnsi"/>
+          <w:sz w:val="24"/>
+          <w:szCs w:val="24"/>
+        </w:rPr>
+        <w:t> Beloved, if God so loved us, we also ought to love one another.</w:t>
       </w:r>
     </w:p>
     <w:p>

</xml_diff>